<commit_message>
﻿v10.1.8: PEEK/POKE for Tiny BASIC interpreter, help + tutorial docs
- Add PEEKa (term) and POKEa=e (statement) to the Tiny BASIC
  interpreter (tutorial/19_tiny_basic.asm). Address a can be decimal
  (0-255, page zero), $-prefixed hex (0-65535, full range --
  including the memory-mapped I/O ports), or a variable letter.
- Fix an inverted-branch bug in the new HEXVAL routine (CMPA's Carry
  is set on greater-than, not less-than, on this CPU -- caught via
  headless testing before it shipped).
- Document PEEK/POKE in help/beboputer_v7_help.html (new "Tiny BASIC
  Interpreter" reference section) and in
  Tiny_BASIC_Interpreter_Tutorial.docx (statement table, term list,
  new Addresses paragraph, Limitations bullet, Appendix table).
- Bump __version__ to 10.1.8.
</commit_message>
<xml_diff>
--- a/tutorial/Tiny_BASIC_Interpreter_Tutorial.docx
+++ b/tutorial/Tiny_BASIC_Interpreter_Tutorial.docx
@@ -73,7 +73,7 @@
           <w:sz w:val="22"/>
           <w:szCs w:val="22"/>
         </w:rPr>
-        <w:t xml:space="preserve">It supports six kinds of statement — LET, PRINT, INPUT, IF...THEN, GOTO, and END — 26 single-letter variables (A-Z), and simple two-term expressions with + and -. Nothing about this is a general-purpose language; it is deliberately the smallest interpreter that can still run a real loop with a real conditional branch, entirely in 8-bit assembly with no multiply or divide instruction to lean on.</w:t>
+        <w:t xml:space="preserve">It supports seven kinds of statement — LET, PRINT, INPUT, IF...THEN, GOTO, POKE, and END — 26 single-letter variables (A-Z), and simple two-term expressions with + and -. Nothing about this is a general-purpose language; it is deliberately the smallest interpreter that can still run a real loop with a real conditional branch, entirely in 8-bit assembly with no multiply or divide instruction to lean on.</w:t>
       </w:r>
     </w:p>
     <w:p>
@@ -723,6 +723,50 @@
                 <w:sz w:val="21"/>
                 <w:szCs w:val="21"/>
               </w:rPr>
+              <w:t xml:space="preserve">POKEa=e</w:t>
+            </w:r>
+          </w:p>
+        </w:tc>
+        <w:tc>
+          <w:tcPr>
+            <w:tcW w:type="dxa" w:w="6950"/>
+            <w:tcMar>
+              <w:top w:type="dxa" w:w="100"/>
+              <w:left w:type="dxa" w:w="120"/>
+              <w:bottom w:type="dxa" w:w="100"/>
+              <w:right w:type="dxa" w:w="120"/>
+            </w:tcMar>
+          </w:tcPr>
+          <w:p>
+            <w:r>
+              <w:rPr>
+                <w:rFonts w:ascii="Calibri" w:cs="Calibri" w:eastAsia="Calibri" w:hAnsi="Calibri"/>
+                <w:sz w:val="21"/>
+                <w:szCs w:val="21"/>
+              </w:rPr>
+              <w:t xml:space="preserve">Write the value of expression e (0-255) to RAM address a — including the memory-mapped I/O ports.</w:t>
+            </w:r>
+          </w:p>
+        </w:tc>
+      </w:tr>
+      <w:tr>
+        <w:tc>
+          <w:tcPr>
+            <w:tcW w:type="dxa" w:w="2400"/>
+            <w:tcMar>
+              <w:top w:type="dxa" w:w="100"/>
+              <w:left w:type="dxa" w:w="120"/>
+              <w:bottom w:type="dxa" w:w="100"/>
+              <w:right w:type="dxa" w:w="120"/>
+            </w:tcMar>
+          </w:tcPr>
+          <w:p>
+            <w:r>
+              <w:rPr>
+                <w:rFonts w:ascii="Courier New" w:cs="Courier New" w:eastAsia="Courier New" w:hAnsi="Courier New"/>
+                <w:sz w:val="21"/>
+                <w:szCs w:val="21"/>
+              </w:rPr>
               <w:t xml:space="preserve">END</w:t>
             </w:r>
           </w:p>
@@ -765,15 +809,7 @@
           <w:sz w:val="22"/>
           <w:szCs w:val="22"/>
         </w:rPr>
-        <w:t xml:space="preserve">An expression</w:t>
-      </w:r>
-      <w:r>
-        <w:rPr>
-          <w:rFonts w:ascii="Calibri" w:cs="Calibri" w:eastAsia="Calibri" w:hAnsi="Calibri"/>
-          <w:sz w:val="22"/>
-          <w:szCs w:val="22"/>
-        </w:rPr>
-        <w:t xml:space="preserve"> (</w:t>
+        <w:t xml:space="preserve">An expression (</w:t>
       </w:r>
       <w:r>
         <w:rPr>
@@ -837,7 +873,7 @@
           <w:sz w:val="22"/>
           <w:szCs w:val="22"/>
         </w:rPr>
-        <w:t xml:space="preserve">. There is never more than one operator, so there is no operator precedence to worry about. A term is either:</w:t>
+        <w:t xml:space="preserve">. There is never more than one operator, so there is no operator precedence to worry about. A term is one of:</w:t>
       </w:r>
     </w:p>
     <w:p>
@@ -878,6 +914,32 @@
     </w:p>
     <w:p>
       <w:pPr>
+        <w:pStyle w:val="ListParagraph"/>
+        <w:numPr>
+          <w:ilvl w:val="0"/>
+          <w:numId w:val="2"/>
+        </w:numPr>
+        <w:spacing w:after="100"/>
+      </w:pPr>
+      <w:r>
+        <w:rPr>
+          <w:rFonts w:ascii="Courier New" w:cs="Courier New" w:eastAsia="Courier New" w:hAnsi="Courier New"/>
+          <w:sz w:val="22"/>
+          <w:szCs w:val="22"/>
+        </w:rPr>
+        <w:t xml:space="preserve">PEEKa</w:t>
+      </w:r>
+      <w:r>
+        <w:rPr>
+          <w:rFonts w:ascii="Calibri" w:cs="Calibri" w:eastAsia="Calibri" w:hAnsi="Calibri"/>
+          <w:sz w:val="22"/>
+          <w:szCs w:val="22"/>
+        </w:rPr>
+        <w:t xml:space="preserve"> — the byte currently stored at address a (see Addresses, below).</w:t>
+      </w:r>
+    </w:p>
+    <w:p>
+      <w:pPr>
         <w:spacing w:after="160"/>
       </w:pPr>
       <w:r>
@@ -887,6 +949,67 @@
           <w:szCs w:val="22"/>
         </w:rPr>
         <w:t xml:space="preserve">Statement indices run 0-9 (ten statements per program), and each statement's typed text is limited to 24 characters. GOTO and THEN targets are always a literal statement index, never a variable.</w:t>
+      </w:r>
+    </w:p>
+    <w:p>
+      <w:pPr>
+        <w:spacing w:after="160"/>
+      </w:pPr>
+      <w:r>
+        <w:rPr>
+          <w:rFonts w:ascii="Calibri" w:cs="Calibri" w:eastAsia="Calibri" w:hAnsi="Calibri"/>
+          <w:sz w:val="22"/>
+          <w:szCs w:val="22"/>
+        </w:rPr>
+        <w:t xml:space="preserve">An address a, used by PEEK and POKE, is a 1-3 digit decimal number (0-255, reaches RAM page zero only), a </w:t>
+      </w:r>
+      <w:r>
+        <w:rPr>
+          <w:rFonts w:ascii="Courier New" w:cs="Courier New" w:eastAsia="Courier New" w:hAnsi="Courier New"/>
+          <w:sz w:val="22"/>
+          <w:szCs w:val="22"/>
+        </w:rPr>
+        <w:t xml:space="preserve">$</w:t>
+      </w:r>
+      <w:r>
+        <w:rPr>
+          <w:rFonts w:ascii="Calibri" w:cs="Calibri" w:eastAsia="Calibri" w:hAnsi="Calibri"/>
+          <w:sz w:val="22"/>
+          <w:szCs w:val="22"/>
+        </w:rPr>
+        <w:t xml:space="preserve"> followed by 1-4 uppercase hex digits (0-65535, reaches anywhere — including the memory-mapped I/O ports (see the app's Help → Peripherals &amp; I/O Map), e.g. </w:t>
+      </w:r>
+      <w:r>
+        <w:rPr>
+          <w:rFonts w:ascii="Courier New" w:cs="Courier New" w:eastAsia="Courier New" w:hAnsi="Courier New"/>
+          <w:sz w:val="22"/>
+          <w:szCs w:val="22"/>
+        </w:rPr>
+        <w:t xml:space="preserve">PEEK$F011</w:t>
+      </w:r>
+      <w:r>
+        <w:rPr>
+          <w:rFonts w:ascii="Calibri" w:cs="Calibri" w:eastAsia="Calibri" w:hAnsi="Calibri"/>
+          <w:sz w:val="22"/>
+          <w:szCs w:val="22"/>
+        </w:rPr>
+        <w:t xml:space="preserve"> reads the Keyboard latch and </w:t>
+      </w:r>
+      <w:r>
+        <w:rPr>
+          <w:rFonts w:ascii="Courier New" w:cs="Courier New" w:eastAsia="Courier New" w:hAnsi="Courier New"/>
+          <w:sz w:val="22"/>
+          <w:szCs w:val="22"/>
+        </w:rPr>
+        <w:t xml:space="preserve">POKE$F031=72</w:t>
+      </w:r>
+      <w:r>
+        <w:rPr>
+          <w:rFonts w:ascii="Calibri" w:cs="Calibri" w:eastAsia="Calibri" w:hAnsi="Calibri"/>
+          <w:sz w:val="22"/>
+          <w:szCs w:val="22"/>
+        </w:rPr>
+        <w:t xml:space="preserve"> writes to the Calculator display), or a single variable letter A-Z (its 0-255 value used as a page-zero address).</w:t>
       </w:r>
     </w:p>
     <w:p>
@@ -1752,6 +1875,40 @@
           <w:szCs w:val="22"/>
         </w:rPr>
         <w:t xml:space="preserve">A malformed statement (a typo in a keyword, a missing operator) has undefined behaviour rather than a syntax error — the interpreter trusts what it reads.</w:t>
+      </w:r>
+    </w:p>
+    <w:p>
+      <w:pPr>
+        <w:pStyle w:val="ListParagraph"/>
+        <w:numPr>
+          <w:ilvl w:val="0"/>
+          <w:numId w:val="2"/>
+        </w:numPr>
+        <w:spacing w:after="100"/>
+      </w:pPr>
+      <w:r>
+        <w:rPr>
+          <w:rFonts w:ascii="Calibri" w:cs="Calibri" w:eastAsia="Calibri" w:hAnsi="Calibri"/>
+          <w:sz w:val="22"/>
+          <w:szCs w:val="22"/>
+        </w:rPr>
+        <w:t xml:space="preserve">PEEK/POKE addresses given as decimal digits or a variable letter reach RAM page zero (0-255) only — use a </w:t>
+      </w:r>
+      <w:r>
+        <w:rPr>
+          <w:rFonts w:ascii="Courier New" w:cs="Courier New" w:eastAsia="Courier New" w:hAnsi="Courier New"/>
+          <w:sz w:val="22"/>
+          <w:szCs w:val="22"/>
+        </w:rPr>
+        <w:t xml:space="preserve">$</w:t>
+      </w:r>
+      <w:r>
+        <w:rPr>
+          <w:rFonts w:ascii="Calibri" w:cs="Calibri" w:eastAsia="Calibri" w:hAnsi="Calibri"/>
+          <w:sz w:val="22"/>
+          <w:szCs w:val="22"/>
+        </w:rPr>
+        <w:t xml:space="preserve"> hex address to reach anywhere else in the 64KB address space, including the I/O ports.</w:t>
       </w:r>
     </w:p>
     <w:p>
@@ -2317,7 +2474,7 @@
                 <w:sz w:val="21"/>
                 <w:szCs w:val="21"/>
               </w:rPr>
-              <w:t xml:space="preserve">END</w:t>
+              <w:t xml:space="preserve">POKEa=e</w:t>
             </w:r>
           </w:p>
         </w:tc>
@@ -2338,7 +2495,7 @@
                 <w:sz w:val="21"/>
                 <w:szCs w:val="21"/>
               </w:rPr>
-              <w:t xml:space="preserve">stop</w:t>
+              <w:t xml:space="preserve">write e to RAM address a</w:t>
             </w:r>
           </w:p>
         </w:tc>
@@ -2361,6 +2518,50 @@
                 <w:sz w:val="21"/>
                 <w:szCs w:val="21"/>
               </w:rPr>
+              <w:t xml:space="preserve">END</w:t>
+            </w:r>
+          </w:p>
+        </w:tc>
+        <w:tc>
+          <w:tcPr>
+            <w:tcW w:type="dxa" w:w="6150"/>
+            <w:tcMar>
+              <w:top w:type="dxa" w:w="100"/>
+              <w:left w:type="dxa" w:w="120"/>
+              <w:bottom w:type="dxa" w:w="100"/>
+              <w:right w:type="dxa" w:w="120"/>
+            </w:tcMar>
+          </w:tcPr>
+          <w:p>
+            <w:r>
+              <w:rPr>
+                <w:rFonts w:ascii="Calibri" w:cs="Calibri" w:eastAsia="Calibri" w:hAnsi="Calibri"/>
+                <w:sz w:val="21"/>
+                <w:szCs w:val="21"/>
+              </w:rPr>
+              <w:t xml:space="preserve">stop</w:t>
+            </w:r>
+          </w:p>
+        </w:tc>
+      </w:tr>
+      <w:tr>
+        <w:tc>
+          <w:tcPr>
+            <w:tcW w:type="dxa" w:w="3200"/>
+            <w:tcMar>
+              <w:top w:type="dxa" w:w="100"/>
+              <w:left w:type="dxa" w:w="120"/>
+              <w:bottom w:type="dxa" w:w="100"/>
+              <w:right w:type="dxa" w:w="120"/>
+            </w:tcMar>
+          </w:tcPr>
+          <w:p>
+            <w:r>
+              <w:rPr>
+                <w:rFonts w:ascii="Courier New" w:cs="Courier New" w:eastAsia="Courier New" w:hAnsi="Courier New"/>
+                <w:sz w:val="21"/>
+                <w:szCs w:val="21"/>
+              </w:rPr>
               <w:t xml:space="preserve">TERM</w:t>
             </w:r>
           </w:p>
@@ -2383,6 +2584,94 @@
                 <w:szCs w:val="21"/>
               </w:rPr>
               <w:t xml:space="preserve">digits (0-255) or a variable letter A-Z</w:t>
+            </w:r>
+          </w:p>
+        </w:tc>
+      </w:tr>
+      <w:tr>
+        <w:tc>
+          <w:tcPr>
+            <w:tcW w:type="dxa" w:w="3200"/>
+            <w:tcMar>
+              <w:top w:type="dxa" w:w="100"/>
+              <w:left w:type="dxa" w:w="120"/>
+              <w:bottom w:type="dxa" w:w="100"/>
+              <w:right w:type="dxa" w:w="120"/>
+            </w:tcMar>
+          </w:tcPr>
+          <w:p>
+            <w:r>
+              <w:rPr>
+                <w:rFonts w:ascii="Courier New" w:cs="Courier New" w:eastAsia="Courier New" w:hAnsi="Courier New"/>
+                <w:sz w:val="21"/>
+                <w:szCs w:val="21"/>
+              </w:rPr>
+              <w:t xml:space="preserve">PEEKa</w:t>
+            </w:r>
+          </w:p>
+        </w:tc>
+        <w:tc>
+          <w:tcPr>
+            <w:tcW w:type="dxa" w:w="6150"/>
+            <w:tcMar>
+              <w:top w:type="dxa" w:w="100"/>
+              <w:left w:type="dxa" w:w="120"/>
+              <w:bottom w:type="dxa" w:w="100"/>
+              <w:right w:type="dxa" w:w="120"/>
+            </w:tcMar>
+          </w:tcPr>
+          <w:p>
+            <w:r>
+              <w:rPr>
+                <w:rFonts w:ascii="Calibri" w:cs="Calibri" w:eastAsia="Calibri" w:hAnsi="Calibri"/>
+                <w:sz w:val="21"/>
+                <w:szCs w:val="21"/>
+              </w:rPr>
+              <w:t xml:space="preserve">byte at RAM address a</w:t>
+            </w:r>
+          </w:p>
+        </w:tc>
+      </w:tr>
+      <w:tr>
+        <w:tc>
+          <w:tcPr>
+            <w:tcW w:type="dxa" w:w="3200"/>
+            <w:tcMar>
+              <w:top w:type="dxa" w:w="100"/>
+              <w:left w:type="dxa" w:w="120"/>
+              <w:bottom w:type="dxa" w:w="100"/>
+              <w:right w:type="dxa" w:w="120"/>
+            </w:tcMar>
+          </w:tcPr>
+          <w:p>
+            <w:r>
+              <w:rPr>
+                <w:rFonts w:ascii="Courier New" w:cs="Courier New" w:eastAsia="Courier New" w:hAnsi="Courier New"/>
+                <w:sz w:val="21"/>
+                <w:szCs w:val="21"/>
+              </w:rPr>
+              <w:t xml:space="preserve">a</w:t>
+            </w:r>
+          </w:p>
+        </w:tc>
+        <w:tc>
+          <w:tcPr>
+            <w:tcW w:type="dxa" w:w="6150"/>
+            <w:tcMar>
+              <w:top w:type="dxa" w:w="100"/>
+              <w:left w:type="dxa" w:w="120"/>
+              <w:bottom w:type="dxa" w:w="100"/>
+              <w:right w:type="dxa" w:w="120"/>
+            </w:tcMar>
+          </w:tcPr>
+          <w:p>
+            <w:r>
+              <w:rPr>
+                <w:rFonts w:ascii="Calibri" w:cs="Calibri" w:eastAsia="Calibri" w:hAnsi="Calibri"/>
+                <w:sz w:val="21"/>
+                <w:szCs w:val="21"/>
+              </w:rPr>
+              <w:t xml:space="preserve">decimal (0-255), $hex (0-65535), or a variable letter</w:t>
             </w:r>
           </w:p>
         </w:tc>

</xml_diff>